<commit_message>
Update IEEE-formatted drafts; add PDF renders for all three formats
</commit_message>
<xml_diff>
--- a/ieee-formatted-jbhi.docx
+++ b/ieee-formatted-jbhi.docx
@@ -2649,18 +2649,6 @@
         </w:rPr>
         <w:t xml:space="preserve">Mounika Avirineni is an independent researcher with extensive experience across financial services, telecommunications, and healthcare.</w:t>
       </w:r>
-    </w:p>
-    <w:p>
-      <w:pPr>
-        <w:sectPr>
-          <w:type w:val="continuous"/>
-          <w:pgSz w:w="12240" w:h="15840" w:orient="portrait"/>
-          <w:pgMar w:top="1080" w:right="1440" w:bottom="1080" w:left="1440" w:header="708" w:footer="708" w:gutter="0"/>
-          <w:pgNumType/>
-          <w:cols w:space="450" w:num="2"/>
-          <w:docGrid w:linePitch="360"/>
-        </w:sectPr>
-      </w:pPr>
     </w:p>
     <w:p>
       <w:pPr>

</xml_diff>